<commit_message>
Selection 50/50, broader Humanities eligibility (FEK), C1 clarified
</commit_message>
<xml_diff>
--- a/dpms_study_guide_en.docx
+++ b/dpms_study_guide_en.docx
@@ -329,12 +329,6 @@
         <w:gridCol w:w="3026"/>
       </w:tblGrid>
       <w:tr>
-        <w:tblPrEx>
-          <w:tblCellMar>
-            <w:top w:w="0" w:type="dxa"/>
-            <w:bottom w:w="0" w:type="dxa"/>
-          </w:tblCellMar>
-        </w:tblPrEx>
         <w:tc>
           <w:tcPr>
             <w:tcW w:w="3000" w:type="dxa"/>
@@ -360,16 +354,7 @@
                 <w:sz w:val="20"/>
                 <w:szCs w:val="20"/>
               </w:rPr>
-              <w:t xml:space="preserve">DEPT. OF ENGLISH LANGUAGE AND LITERATURE (Responsible Department) </w:t>
-            </w:r>
-            <w:r>
-              <w:rPr>
-                <w:b/>
-                <w:bCs/>
-                <w:sz w:val="20"/>
-                <w:szCs w:val="20"/>
-              </w:rPr>
-              <w:t>http://www.enl.uoa.gr</w:t>
+              <w:t>DEPT. OF ENGLISH LANGUAGE AND LITERATURE (Responsible Department) http://www.enl.uoa.gr</w:t>
             </w:r>
           </w:p>
         </w:tc>
@@ -458,12 +443,6 @@
         <w:gridCol w:w="6026"/>
       </w:tblGrid>
       <w:tr>
-        <w:tblPrEx>
-          <w:tblCellMar>
-            <w:top w:w="0" w:type="dxa"/>
-            <w:bottom w:w="0" w:type="dxa"/>
-          </w:tblCellMar>
-        </w:tblPrEx>
         <w:tc>
           <w:tcPr>
             <w:tcW w:w="3000" w:type="dxa"/>
@@ -521,12 +500,6 @@
         </w:tc>
       </w:tr>
       <w:tr>
-        <w:tblPrEx>
-          <w:tblCellMar>
-            <w:top w:w="0" w:type="dxa"/>
-            <w:bottom w:w="0" w:type="dxa"/>
-          </w:tblCellMar>
-        </w:tblPrEx>
         <w:tc>
           <w:tcPr>
             <w:tcW w:w="3000" w:type="dxa"/>
@@ -578,14 +551,7 @@
                 <w:sz w:val="20"/>
                 <w:szCs w:val="20"/>
               </w:rPr>
-              <w:t xml:space="preserve">Dionysis Goutsos, Department of Philology Spyridoula Bella, Department of Philology </w:t>
-            </w:r>
-            <w:r>
-              <w:rPr>
-                <w:sz w:val="20"/>
-                <w:szCs w:val="20"/>
-              </w:rPr>
-              <w:t>Tatiana Borisova, Department of Russian Language and Literature and Slavic Studies Elena Sartori, Department of Russian Language and Literature and Slavic Studies Olga Alexandropoulou, Department of Russian Language and Literature and Slavic Studies</w:t>
+              <w:t>Dionysis Goutsos, Department of Philology Spyridoula Bella, Department of Philology Tatiana Borisova, Department of Russian Language and Literature and Slavic Studies Elena Sartori, Department of Russian Language and Literature and Slavic Studies Olga Alexandropoulou, Department of Russian Language and Literature and Slavic Studies</w:t>
             </w:r>
           </w:p>
         </w:tc>
@@ -622,12 +588,6 @@
         <w:gridCol w:w="8079"/>
       </w:tblGrid>
       <w:tr>
-        <w:tblPrEx>
-          <w:tblCellMar>
-            <w:top w:w="0" w:type="dxa"/>
-            <w:bottom w:w="0" w:type="dxa"/>
-          </w:tblCellMar>
-        </w:tblPrEx>
         <w:tc>
           <w:tcPr>
             <w:tcW w:w="3000" w:type="dxa"/>
@@ -685,12 +645,6 @@
         </w:tc>
       </w:tr>
       <w:tr>
-        <w:tblPrEx>
-          <w:tblCellMar>
-            <w:top w:w="0" w:type="dxa"/>
-            <w:bottom w:w="0" w:type="dxa"/>
-          </w:tblCellMar>
-        </w:tblPrEx>
         <w:tc>
           <w:tcPr>
             <w:tcW w:w="3000" w:type="dxa"/>
@@ -748,12 +702,6 @@
         </w:tc>
       </w:tr>
       <w:tr>
-        <w:tblPrEx>
-          <w:tblCellMar>
-            <w:top w:w="0" w:type="dxa"/>
-            <w:bottom w:w="0" w:type="dxa"/>
-          </w:tblCellMar>
-        </w:tblPrEx>
         <w:tc>
           <w:tcPr>
             <w:tcW w:w="3000" w:type="dxa"/>
@@ -811,12 +759,6 @@
         </w:tc>
       </w:tr>
       <w:tr>
-        <w:tblPrEx>
-          <w:tblCellMar>
-            <w:top w:w="0" w:type="dxa"/>
-            <w:bottom w:w="0" w:type="dxa"/>
-          </w:tblCellMar>
-        </w:tblPrEx>
         <w:tc>
           <w:tcPr>
             <w:tcW w:w="3000" w:type="dxa"/>
@@ -874,12 +816,6 @@
         </w:tc>
       </w:tr>
       <w:tr>
-        <w:tblPrEx>
-          <w:tblCellMar>
-            <w:top w:w="0" w:type="dxa"/>
-            <w:bottom w:w="0" w:type="dxa"/>
-          </w:tblCellMar>
-        </w:tblPrEx>
         <w:tc>
           <w:tcPr>
             <w:tcW w:w="3000" w:type="dxa"/>
@@ -937,12 +873,6 @@
         </w:tc>
       </w:tr>
       <w:tr>
-        <w:tblPrEx>
-          <w:tblCellMar>
-            <w:top w:w="0" w:type="dxa"/>
-            <w:bottom w:w="0" w:type="dxa"/>
-          </w:tblCellMar>
-        </w:tblPrEx>
         <w:tc>
           <w:tcPr>
             <w:tcW w:w="3000" w:type="dxa"/>
@@ -1045,10 +975,7 @@
         <w:spacing w:after="120"/>
       </w:pPr>
       <w:r>
-        <w:t>Three (3) semesters is the maximum time for completing the programme. Students are entitled to make a written request for suspending studies or suspending the Dissertation preparation. SIC may make the suspension decision if the student presents the necessary supporting documents (e.g. of serious health condition). In case of a suspension decision, the student joins the respective semester of the next programme cycle, whenever it is run, and continues studies. Suspension of studies can only be granted once.</w:t>
-      </w:r>
-      <w:r>
-        <w:t xml:space="preserve"> During the postponement period, the student status is removed and the skipped semester is not included in the estimated duration of studies.</w:t>
+        <w:t>Three (3) semesters is the maximum time for completing the programme. Students are entitled to make a written request for suspending studies or suspending the Dissertation preparation. SIC may make the suspension decision if the student presents the necessary supporting documents (e.g. of serious health condition). In case of a suspension decision, the student joins the respective semester of the next programme cycle, whenever it is run, and continues studies. Suspension of studies can only be granted once. During the postponement period, the student status is removed and the skipped semester is not included in the estimated duration of studies.</w:t>
       </w:r>
     </w:p>
     <w:p>
@@ -1264,12 +1191,6 @@
         <w:gridCol w:w="4626"/>
       </w:tblGrid>
       <w:tr>
-        <w:tblPrEx>
-          <w:tblCellMar>
-            <w:top w:w="0" w:type="dxa"/>
-            <w:bottom w:w="0" w:type="dxa"/>
-          </w:tblCellMar>
-        </w:tblPrEx>
         <w:tc>
           <w:tcPr>
             <w:tcW w:w="2800" w:type="dxa"/>
@@ -1359,12 +1280,6 @@
         </w:tc>
       </w:tr>
       <w:tr>
-        <w:tblPrEx>
-          <w:tblCellMar>
-            <w:top w:w="0" w:type="dxa"/>
-            <w:bottom w:w="0" w:type="dxa"/>
-          </w:tblCellMar>
-        </w:tblPrEx>
         <w:tc>
           <w:tcPr>
             <w:tcW w:w="2800" w:type="dxa"/>
@@ -1445,12 +1360,6 @@
         </w:tc>
       </w:tr>
       <w:tr>
-        <w:tblPrEx>
-          <w:tblCellMar>
-            <w:top w:w="0" w:type="dxa"/>
-            <w:bottom w:w="0" w:type="dxa"/>
-          </w:tblCellMar>
-        </w:tblPrEx>
         <w:tc>
           <w:tcPr>
             <w:tcW w:w="2800" w:type="dxa"/>
@@ -1531,12 +1440,6 @@
         </w:tc>
       </w:tr>
       <w:tr>
-        <w:tblPrEx>
-          <w:tblCellMar>
-            <w:top w:w="0" w:type="dxa"/>
-            <w:bottom w:w="0" w:type="dxa"/>
-          </w:tblCellMar>
-        </w:tblPrEx>
         <w:tc>
           <w:tcPr>
             <w:tcW w:w="2800" w:type="dxa"/>
@@ -1617,12 +1520,6 @@
         </w:tc>
       </w:tr>
       <w:tr>
-        <w:tblPrEx>
-          <w:tblCellMar>
-            <w:top w:w="0" w:type="dxa"/>
-            <w:bottom w:w="0" w:type="dxa"/>
-          </w:tblCellMar>
-        </w:tblPrEx>
         <w:tc>
           <w:tcPr>
             <w:tcW w:w="2800" w:type="dxa"/>
@@ -1703,12 +1600,6 @@
         </w:tc>
       </w:tr>
       <w:tr>
-        <w:tblPrEx>
-          <w:tblCellMar>
-            <w:top w:w="0" w:type="dxa"/>
-            <w:bottom w:w="0" w:type="dxa"/>
-          </w:tblCellMar>
-        </w:tblPrEx>
         <w:tc>
           <w:tcPr>
             <w:tcW w:w="2800" w:type="dxa"/>
@@ -1789,12 +1680,6 @@
         </w:tc>
       </w:tr>
       <w:tr>
-        <w:tblPrEx>
-          <w:tblCellMar>
-            <w:top w:w="0" w:type="dxa"/>
-            <w:bottom w:w="0" w:type="dxa"/>
-          </w:tblCellMar>
-        </w:tblPrEx>
         <w:tc>
           <w:tcPr>
             <w:tcW w:w="2800" w:type="dxa"/>
@@ -1939,12 +1824,6 @@
         <w:gridCol w:w="1526"/>
       </w:tblGrid>
       <w:tr>
-        <w:tblPrEx>
-          <w:tblCellMar>
-            <w:top w:w="0" w:type="dxa"/>
-            <w:bottom w:w="0" w:type="dxa"/>
-          </w:tblCellMar>
-        </w:tblPrEx>
         <w:tc>
           <w:tcPr>
             <w:tcW w:w="5000" w:type="dxa"/>
@@ -2034,12 +1913,6 @@
         </w:tc>
       </w:tr>
       <w:tr>
-        <w:tblPrEx>
-          <w:tblCellMar>
-            <w:top w:w="0" w:type="dxa"/>
-            <w:bottom w:w="0" w:type="dxa"/>
-          </w:tblCellMar>
-        </w:tblPrEx>
         <w:tc>
           <w:tcPr>
             <w:tcW w:w="5000" w:type="dxa"/>
@@ -2120,12 +1993,6 @@
         </w:tc>
       </w:tr>
       <w:tr>
-        <w:tblPrEx>
-          <w:tblCellMar>
-            <w:top w:w="0" w:type="dxa"/>
-            <w:bottom w:w="0" w:type="dxa"/>
-          </w:tblCellMar>
-        </w:tblPrEx>
         <w:tc>
           <w:tcPr>
             <w:tcW w:w="5000" w:type="dxa"/>
@@ -2206,12 +2073,6 @@
         </w:tc>
       </w:tr>
       <w:tr>
-        <w:tblPrEx>
-          <w:tblCellMar>
-            <w:top w:w="0" w:type="dxa"/>
-            <w:bottom w:w="0" w:type="dxa"/>
-          </w:tblCellMar>
-        </w:tblPrEx>
         <w:tc>
           <w:tcPr>
             <w:tcW w:w="5000" w:type="dxa"/>
@@ -2292,12 +2153,6 @@
         </w:tc>
       </w:tr>
       <w:tr>
-        <w:tblPrEx>
-          <w:tblCellMar>
-            <w:top w:w="0" w:type="dxa"/>
-            <w:bottom w:w="0" w:type="dxa"/>
-          </w:tblCellMar>
-        </w:tblPrEx>
         <w:tc>
           <w:tcPr>
             <w:tcW w:w="5000" w:type="dxa"/>
@@ -2410,12 +2265,6 @@
         <w:gridCol w:w="1526"/>
       </w:tblGrid>
       <w:tr>
-        <w:tblPrEx>
-          <w:tblCellMar>
-            <w:top w:w="0" w:type="dxa"/>
-            <w:bottom w:w="0" w:type="dxa"/>
-          </w:tblCellMar>
-        </w:tblPrEx>
         <w:tc>
           <w:tcPr>
             <w:tcW w:w="5000" w:type="dxa"/>
@@ -2505,12 +2354,6 @@
         </w:tc>
       </w:tr>
       <w:tr>
-        <w:tblPrEx>
-          <w:tblCellMar>
-            <w:top w:w="0" w:type="dxa"/>
-            <w:bottom w:w="0" w:type="dxa"/>
-          </w:tblCellMar>
-        </w:tblPrEx>
         <w:tc>
           <w:tcPr>
             <w:tcW w:w="5000" w:type="dxa"/>
@@ -2591,12 +2434,6 @@
         </w:tc>
       </w:tr>
       <w:tr>
-        <w:tblPrEx>
-          <w:tblCellMar>
-            <w:top w:w="0" w:type="dxa"/>
-            <w:bottom w:w="0" w:type="dxa"/>
-          </w:tblCellMar>
-        </w:tblPrEx>
         <w:tc>
           <w:tcPr>
             <w:tcW w:w="5000" w:type="dxa"/>
@@ -2677,12 +2514,6 @@
         </w:tc>
       </w:tr>
       <w:tr>
-        <w:tblPrEx>
-          <w:tblCellMar>
-            <w:top w:w="0" w:type="dxa"/>
-            <w:bottom w:w="0" w:type="dxa"/>
-          </w:tblCellMar>
-        </w:tblPrEx>
         <w:tc>
           <w:tcPr>
             <w:tcW w:w="5000" w:type="dxa"/>
@@ -2763,12 +2594,6 @@
         </w:tc>
       </w:tr>
       <w:tr>
-        <w:tblPrEx>
-          <w:tblCellMar>
-            <w:top w:w="0" w:type="dxa"/>
-            <w:bottom w:w="0" w:type="dxa"/>
-          </w:tblCellMar>
-        </w:tblPrEx>
         <w:tc>
           <w:tcPr>
             <w:tcW w:w="5000" w:type="dxa"/>
@@ -2849,12 +2674,6 @@
         </w:tc>
       </w:tr>
       <w:tr>
-        <w:tblPrEx>
-          <w:tblCellMar>
-            <w:top w:w="0" w:type="dxa"/>
-            <w:bottom w:w="0" w:type="dxa"/>
-          </w:tblCellMar>
-        </w:tblPrEx>
         <w:tc>
           <w:tcPr>
             <w:tcW w:w="5000" w:type="dxa"/>
@@ -2980,7 +2799,19 @@
         <w:spacing w:after="120"/>
       </w:pPr>
       <w:r>
-        <w:t>For the 2026-2028 cycle, the Steering Committee has replaced the written entrance examination with a portfolio-based evaluation and an oral interview. Candidates are evaluated on the basis of portfolio evaluation (70%) and oral interview (30%).</w:t>
+        <w:t xml:space="preserve">For the 2026-2028 cycle, the Steering Committee has replaced the written entrance examination with a portfolio-based evaluation and an oral interview. Candidates are evaluated on the basis of </w:t>
+      </w:r>
+      <w:r>
+        <w:t>Portfolio evaluation (50%)</w:t>
+      </w:r>
+      <w:r>
+        <w:t xml:space="preserve"> and </w:t>
+      </w:r>
+      <w:r>
+        <w:t>Oral interview (50%)</w:t>
+      </w:r>
+      <w:r>
+        <w:t>.</w:t>
       </w:r>
     </w:p>
     <w:p>
@@ -3205,13 +3036,24 @@
           <w:b/>
           <w:bCs/>
         </w:rPr>
-        <w:t xml:space="preserve">Portfolio evaluation (70% of the total marks). </w:t>
-      </w:r>
-      <w:r>
-        <w:t>The portfolio comprises: BA grade (minimum Very Good; a lower grade may be accepted if candidates have a Very Good grade in courses or a BA dissertation relevant to the Postgraduate Programme, or if they have acquired a second degree, another postgraduate title, research experience, or have written a detailed research paper); grades of undergraduate courses relevant to the postgraduate specialization; research experience (e.g. seminars, participation in research projects, publications); proficiency in Greek</w:t>
-      </w:r>
-      <w:r>
-        <w:t>, English and Russian at C1 level or above (mandatory); one (1) letter of recommendation; relevant professional experience and knowledge of new technologies.</w:t>
+        <w:t>Portfolio evaluation (</w:t>
+      </w:r>
+      <w:r>
+        <w:rPr>
+          <w:b/>
+          <w:bCs/>
+        </w:rPr>
+        <w:t>50%</w:t>
+      </w:r>
+      <w:r>
+        <w:rPr>
+          <w:b/>
+          <w:bCs/>
+        </w:rPr>
+        <w:t xml:space="preserve"> of the total marks). </w:t>
+      </w:r>
+      <w:r>
+        <w:t>The portfolio comprises: BA grade (minimum Very Good; a lower grade may be accepted if candidates have a Very Good grade in courses or a BA dissertation relevant to the Postgraduate Programme, or if they have acquired a second degree, another postgraduate title, research experience, or have written a detailed research paper); grades of undergraduate courses relevant to the postgraduate specialization; research experience (e.g. seminars, participation in research projects, publications); proficiency in Greek, English and Russian at C1 level or above (mandatory); one (1) letter of recommendation; relevant professional experience and knowledge of new technologies.</w:t>
       </w:r>
     </w:p>
     <w:p>
@@ -3228,7 +3070,21 @@
           <w:b/>
           <w:bCs/>
         </w:rPr>
-        <w:t xml:space="preserve">Oral interview (30% of the total marks, pass mark: 6/10). </w:t>
+        <w:t>Oral interview (</w:t>
+      </w:r>
+      <w:r>
+        <w:rPr>
+          <w:b/>
+          <w:bCs/>
+        </w:rPr>
+        <w:t>50%</w:t>
+      </w:r>
+      <w:r>
+        <w:rPr>
+          <w:b/>
+          <w:bCs/>
+        </w:rPr>
+        <w:t xml:space="preserve"> of the total marks, pass mark: 6/10). </w:t>
       </w:r>
       <w:r>
         <w:t>The Selection Committee evaluates academic background, research interests, critical engagement with translation-related topics, and multilingual competence in the three working languages. Only candidates whose portfolio score meets the minimum threshold participate in the oral interview.</w:t>
@@ -3527,10 +3383,7 @@
         <w:spacing w:after="100"/>
       </w:pPr>
       <w:r>
-        <w:t xml:space="preserve">The Steering Interdepartmental Committee may decide to discontinue a student's attendance if: their attendance is poor (only two justified absences are allowed per course for medical reasons, as specified in article 7 of the Regulation); they have failed the examination of a module or modules (including the examination by the three-member Committee) without completing the programme; they exceed the maximum study duration; they break existing regulations according to the relevant Disciplinary Board code; ex </w:t>
-      </w:r>
-      <w:r>
-        <w:t>officio, after an application to the Department; or if they commit plagiarism (Law 2121/93).</w:t>
+        <w:t>The Steering Interdepartmental Committee may decide to discontinue a student's attendance if: their attendance is poor (only two justified absences are allowed per course for medical reasons, as specified in article 7 of the Regulation); they have failed the examination of a module or modules (including the examination by the three-member Committee) without completing the programme; they exceed the maximum study duration; they break existing regulations according to the relevant Disciplinary Board code; ex officio, after an application to the Department; or if they commit plagiarism (Law 2121/93).</w:t>
       </w:r>
     </w:p>
     <w:p>
@@ -3538,10 +3391,7 @@
         <w:spacing w:after="100"/>
       </w:pPr>
       <w:r>
-        <w:t xml:space="preserve">More specifically: Plagiarism is the intentional or unintentional verbatim or paraphrased copying of parts of a text (irrespective of their size) from any print source (e.g. articles, books, newspapers, magazines, other students' papers) or online source, without a full bibliographical reference to the source. Any third-party interference to the content or structure of a paper (with no relevant reference) or the assignment of a paper for writing by a third party is also considered plagiarism. Plagiarism is </w:t>
-      </w:r>
-      <w:r>
-        <w:t>a serious misconduct of academic ethics and leads to sanctions which, depending on the severity (to be determined by SIC), may vary from the student receiving a failing mark for the paper, failing the course, or permanently leaving the MA programme. This applies for papers of particular courses and MA dissertations.</w:t>
+        <w:t>More specifically: Plagiarism is the intentional or unintentional verbatim or paraphrased copying of parts of a text (irrespective of their size) from any print source (e.g. articles, books, newspapers, magazines, other students' papers) or online source, without a full bibliographical reference to the source. Any third-party interference to the content or structure of a paper (with no relevant reference) or the assignment of a paper for writing by a third party is also considered plagiarism. Plagiarism is a serious misconduct of academic ethics and leads to sanctions which, depending on the severity (to be determined by SIC), may vary from the student receiving a failing mark for the paper, failing the course, or permanently leaving the MA programme. This applies for papers of particular courses and MA dissertations.</w:t>
       </w:r>
     </w:p>
     <w:p>
@@ -4115,10 +3965,7 @@
         <w:spacing w:after="160"/>
       </w:pPr>
       <w:r>
-        <w:t>Variation across time, region and register, and its consequences for translation. The course examines strategies of interlingual and intra-lingual translation of older and dialectal texts, taking a historical-linguistic approach, and the role of translation in language change and language contact. Particular attention is paid to stylistically marked texts in the three working languages. A central methodological thread running through the course is the meta-digital analysis of diachronic and contact-driven v</w:t>
-      </w:r>
-      <w:r>
-        <w:t>ariation: students work with digital corpora, annotation tools, and corpus-query platforms to trace how variation patterns are refracted, neutralized, or amplified in translation across time and language pairs. The GlossaContact Lab resources, including diachronic corpora of Greek, English, and contact varieties, provide the empirical base for hands-on investigation across all three working languages of the programme. Assessment is by a final research assignment, weekly assignments and quizzes.</w:t>
+        <w:t>Variation across time, region and register, and its consequences for translation. The course examines strategies of interlingual and intra-lingual translation of older and dialectal texts, taking a historical-linguistic approach, and the role of translation in language change and language contact. Particular attention is paid to stylistically marked texts in the three working languages. A central methodological thread running through the course is the meta-digital analysis of diachronic and contact-driven variation: students work with digital corpora, annotation tools, and corpus-query platforms to trace how variation patterns are refracted, neutralized, or amplified in translation across time and language pairs. The GlossaContact Lab resources, including diachronic corpora of Greek, English, and contact varieties, provide the empirical base for hands-on investigation across all three working languages of the programme. Assessment is by a final research assignment, weekly assignments and quizzes.</w:t>
       </w:r>
     </w:p>
     <w:p>
@@ -4210,10 +4057,7 @@
         <w:spacing w:after="120"/>
       </w:pPr>
       <w:r>
-        <w:t>An original, individually authored piece of research. The dissertation may be written in Greek, English or Russian, reflecting the programme's genuinely multilingual character. The student proposes a title and a supervisor; the Steering Committee assigns a three-member examining committee. The dissertation is between 15,000 and 20,000 words, must be original, must follow standard academic conventions, and is defended orally before the examining committee. Approved dissertations are deposited in NKUA's digit</w:t>
-      </w:r>
-      <w:r>
-        <w:t>al repository PERGAMOS.</w:t>
+        <w:t>An original, individually authored piece of research. The dissertation may be written in Greek, English or Russian, reflecting the programme's genuinely multilingual character. The student proposes a title and a supervisor; the Steering Committee assigns a three-member examining committee. The dissertation is between 15,000 and 20,000 words, must be original, must follow standard academic conventions, and is defended orally before the examining committee. Approved dissertations are deposited in NKUA's digital repository PERGAMOS.</w:t>
       </w:r>
     </w:p>
     <w:p>

</xml_diff>

<commit_message>
DPMS study guide DOCX/PDF: Winter Language Contact (Giannaris); Spring Issues of Text Analysis (Goutsos); Literacies/Intzidis removed
</commit_message>
<xml_diff>
--- a/dpms_study_guide_en.docx
+++ b/dpms_study_guide_en.docx
@@ -2095,7 +2095,7 @@
                 <w:sz w:val="20"/>
                 <w:szCs w:val="20"/>
               </w:rPr>
-              <w:t>Text Linguistics</w:t>
+              <w:t>Language Contact</w:t>
             </w:r>
           </w:p>
         </w:tc>
@@ -2121,7 +2121,7 @@
                 <w:sz w:val="20"/>
                 <w:szCs w:val="20"/>
               </w:rPr>
-              <w:t>D. Goutsos</w:t>
+              <w:t>T. Giannaris</w:t>
             </w:r>
           </w:p>
         </w:tc>
@@ -2536,7 +2536,7 @@
                 <w:sz w:val="20"/>
                 <w:szCs w:val="20"/>
               </w:rPr>
-              <w:t>Literacies and Translation</w:t>
+              <w:t>Issues of Text Analysis</w:t>
             </w:r>
           </w:p>
         </w:tc>
@@ -2562,7 +2562,7 @@
                 <w:sz w:val="20"/>
                 <w:szCs w:val="20"/>
               </w:rPr>
-              <w:t>V. Intzidis</w:t>
+              <w:t>D. Goutsos</w:t>
             </w:r>
           </w:p>
         </w:tc>
@@ -3650,7 +3650,7 @@
           <w:b/>
           <w:bCs/>
         </w:rPr>
-        <w:t>Text Linguistics</w:t>
+        <w:t>Language Contact</w:t>
       </w:r>
       <w:r>
         <w:t xml:space="preserve"> </w:t>
@@ -3686,7 +3686,10 @@
         <w:t xml:space="preserve"> </w:t>
       </w:r>
       <w:r>
-        <w:t>Instructor: Dr. Dionysis Goutsos</w:t>
+        <w:t xml:space="preserve">Instructor: </w:t>
+      </w:r>
+      <w:r>
+        <w:t>Dr. Thanasis Giannaris</w:t>
       </w:r>
     </w:p>
     <w:p>
@@ -3694,7 +3697,25 @@
         <w:spacing w:after="160"/>
       </w:pPr>
       <w:r>
-        <w:t>Text as the primary unit of translation. The course examines cohesion, coherence, register and discourse organisation across Greek, English and Russian, drawing on systemic-functional and corpus-based approaches. Students apply tools for textual analysis to translator decision-making and develop a comparative perspective on discourse organisation across the three languages. Assessment is by analytical assignments and a final corpus-based project.</w:t>
+        <w:t>Theory and methods of language contact applied to translation.</w:t>
+      </w:r>
+      <w:r>
+        <w:t xml:space="preserve"> </w:t>
+      </w:r>
+      <w:r>
+        <w:t>The course examines borrowing, interference, code-switching, and contact-induced change, with a focus on the role of contact in translation across Greek, English and Russian.</w:t>
+      </w:r>
+      <w:r>
+        <w:t xml:space="preserve"> </w:t>
+      </w:r>
+      <w:r>
+        <w:t>Students engage with historical and contemporary case studies of language contact and develop tools for analysing contact phenomena in source and target texts.</w:t>
+      </w:r>
+      <w:r>
+        <w:t xml:space="preserve"> </w:t>
+      </w:r>
+      <w:r>
+        <w:t>Assessment is by analytical assignments and a final research paper.</w:t>
       </w:r>
     </w:p>
     <w:p>
@@ -3882,7 +3903,7 @@
           <w:b/>
           <w:bCs/>
         </w:rPr>
-        <w:t>Literacies and Translation</w:t>
+        <w:t>Issues of Text Analysis</w:t>
       </w:r>
       <w:r>
         <w:t xml:space="preserve"> </w:t>
@@ -3918,7 +3939,10 @@
         <w:t xml:space="preserve"> </w:t>
       </w:r>
       <w:r>
-        <w:t>Instructor: Dr. Vangelis Intzidis</w:t>
+        <w:t xml:space="preserve">Instructor: </w:t>
+      </w:r>
+      <w:r>
+        <w:t>Dr. Dionysis Goutsos</w:t>
       </w:r>
     </w:p>
     <w:p>
@@ -3926,7 +3950,25 @@
         <w:spacing w:after="160"/>
       </w:pPr>
       <w:r>
-        <w:t>Literacy practices and their consequences for translation. The course addresses writing systems, schooling traditions, and the multilingual and digital literacies that shape contemporary readers and translators across the three working languages of the programme. Topics include the cognitive and social dimensions of reading and writing across languages, the place of translation in literacy education, and emerging AI-mediated literacies. Assessment is by a research essay and a small-scale empirical project.</w:t>
+        <w:t>Issues of text and discourse analysis applied to translation.</w:t>
+      </w:r>
+      <w:r>
+        <w:t xml:space="preserve"> </w:t>
+      </w:r>
+      <w:r>
+        <w:t>The course examines cohesion, coherence, register and discourse organisation across Greek, English and Russian, drawing on systemic-functional and corpus-based approaches.</w:t>
+      </w:r>
+      <w:r>
+        <w:t xml:space="preserve"> </w:t>
+      </w:r>
+      <w:r>
+        <w:t>Students apply tools for textual analysis to translator decision-making and develop a comparative perspective on discourse organisation across the three languages.</w:t>
+      </w:r>
+      <w:r>
+        <w:t xml:space="preserve"> </w:t>
+      </w:r>
+      <w:r>
+        <w:t>Assessment is by analytical assignments and a final corpus-based project.</w:t>
       </w:r>
     </w:p>
     <w:p>

</xml_diff>